<commit_message>
Move answer keys out of 6 student worksheets into separate answer docs
Co-Authored-By: Claude Opus 5.5 <noreply@anthropic.com>
Claude-Session: https://claude.ai/code/session_01WeyJoxdqkgaWP2E9bmUhY7
</commit_message>
<xml_diff>
--- a/e1/speaking-listening/docs/task3-in-the-kitchen-questions-and-answers.docx
+++ b/e1/speaking-listening/docs/task3-in-the-kitchen-questions-and-answers.docx
@@ -43,19 +43,24 @@
     <w:p>
       <w:pPr>
         <w:pStyle w:val="Heading1"/>
+        <w:keepNext/>
       </w:pPr>
       <w:r>
         <w:t xml:space="preserve">In the Kitchen – Questions and Answers</w:t>
       </w:r>
     </w:p>
     <w:p>
-      <w:pPr/>
+      <w:pPr>
+        <w:keepNext/>
+      </w:pPr>
       <w:r>
         <w:t xml:space="preserve">Name: ______________________    Date: ______________</w:t>
       </w:r>
     </w:p>
     <w:p>
-      <w:pPr/>
+      <w:pPr>
+        <w:keepNext/>
+      </w:pPr>
       <w:r>
         <w:rPr>
           <w:b/>
@@ -102,6 +107,7 @@
     <w:p>
       <w:pPr>
         <w:pStyle w:val="Heading2"/>
+        <w:keepNext/>
       </w:pPr>
       <w:r>
         <w:t xml:space="preserve">Questions</w:t>
@@ -588,6 +594,7 @@
     <w:p>
       <w:pPr>
         <w:pStyle w:val="Heading2"/>
+        <w:keepNext/>
       </w:pPr>
       <w:r>
         <w:t xml:space="preserve">Answers</w:t>
@@ -954,20 +961,6 @@
         </w:tc>
       </w:tr>
     </w:tbl>
-    <w:p>
-      <w:pPr>
-        <w:pStyle w:val="Heading2"/>
-      </w:pPr>
-      <w:r>
-        <w:t xml:space="preserve">Answer key (teacher only)</w:t>
-      </w:r>
-    </w:p>
-    <w:p>
-      <w:pPr/>
-      <w:r>
-        <w:t xml:space="preserve">1 i · 2 l · 3 g · 4 j · 5 e · 6 m · 7 h · 8 b · 9 c · 10 k · 11 f · 12 d · 13 a</w:t>
-      </w:r>
-    </w:p>
     <w:sectPr>
       <w:pgSz w:w="11906" w:h="16838"/>
       <w:pgMar w:top="1440" w:right="1440" w:bottom="1440" w:left="1440" w:header="720" w:footer="720" w:gutter="0"/>

</xml_diff>